<commit_message>
docs: verify database design against live MariaDB schemas
</commit_message>
<xml_diff>
--- a/docs/DB_DESIGN.docx
+++ b/docs/DB_DESIGN.docx
@@ -16,7 +16,7 @@
         <w:widowControl/>
       </w:pPr>
       <w:r>
-        <w:t>作成日：2026年10月3日</w:t>
+        <w:t>作成日：2026年10月3日　実DB確認日：2026年10月5日</w:t>
       </w:r>
     </w:p>
     <w:p>
@@ -33,7 +33,7 @@
         <w:widowControl/>
       </w:pPr>
       <w:r>
-        <w:t>本書は NewBooze（日本酒紹介・好み診断アプリ）のDB設計を、既存の作成SQLと実装に基づいて整理したものです。定義の基準は data/create_issho_no_deai.sql です。実稼働DBへの接続・定義照合は行っていません。</w:t>
+        <w:t>本書は NewBooze（日本酒紹介・好み診断アプリ）の現行DB構造を示す設計書です。2026年10月5日に指定のphpMyAdminへログインし、issho_no_deai と newbooze の全18テーブルのCREATE定義を確認しました。主な対象はローカル接続設定が指す issho_no_deai です。カラム・型・初期値・主キー・一意制約・索引・外部キー・削除規則・CHECK制約を実DBに照合し、保存ルールはアプリ実装を併せて参照しています。</w:t>
       </w:r>
     </w:p>
     <w:p>
@@ -42,7 +42,7 @@
         <w:widowControl/>
       </w:pPr>
       <w:r>
-        <w:t>DB：MySQL互換（MySQL / MariaDB）。この設計書では特定のサーバーバージョンを仮定しません。</w:t>
+        <w:t>確認サーバー：127.0.0.1、MariaDB 10.11.19（Homebrew）。phpMyAdmin 5.2.3。</w:t>
       </w:r>
     </w:p>
     <w:p>
@@ -51,7 +51,7 @@
         <w:widowControl/>
       </w:pPr>
       <w:r>
-        <w:t>新規作成SQLのDB名：issho_no_deai。アプリの既定接続先：newbooze（ローカル設定で変更可能）。</w:t>
+        <w:t>ローカル接続設定：issho_no_deai。既定設定：newbooze。両DBとも存在します。起動中プロセスの接続先までは本調査で確認していません。</w:t>
       </w:r>
     </w:p>
     <w:p>
@@ -69,7 +69,7 @@
         <w:widowControl/>
       </w:pPr>
       <w:r>
-        <w:t>時刻：新規作成SQLのセッションは日本時間（+09:00）。接続時にも時刻設定を統一します。</w:t>
+        <w:t>接続URLの時刻指定：Asia/Tokyo。DBのセッション・グローバルタイムゾーンは未取得のため、接続時に統一して運用します。</w:t>
       </w:r>
     </w:p>
     <w:p>
@@ -78,7 +78,7 @@
         <w:widowControl/>
       </w:pPr>
       <w:r>
-        <w:t>全18テーブル。単独の id は BIGINT UNSIGNED・自動採番。中間テーブルは複合主キーを使用します。</w:t>
+        <w:t>全18テーブル、外部キー23本。単独の id は BIGINT(20) UNSIGNED・自動採番。中間テーブルは複合主キーを使用します。</w:t>
       </w:r>
     </w:p>
     <w:p>
@@ -87,7 +87,7 @@
         <w:widowControl/>
       </w:pPr>
       <w:r>
-        <w:t>既存DBを変更するための資料ではなく、新規作成SQLの構造を説明する設計書です。</w:t>
+        <w:t>調査では構造の参照のみを行いました。DBの定義・保存データは変更していません。</w:t>
       </w:r>
     </w:p>
     <w:p>
@@ -1529,7 +1529,7 @@
         <w:widowControl/>
       </w:pPr>
       <w:r>
-        <w:t>「必須」は NOT NULL を示します。PK＝主キー、FK＝外部キー。BOOLEAN は真偽値です。デフォルトなしの必須項目は登録時に値を指定します。</w:t>
+        <w:t>「必須」は NOT NULL を示します。PK＝主キー、FK＝外部キー。型は実DBの表示に合わせています。BIGINT(20)・INT(11)等の括弧内は表示幅で、桁数制限ではありません。真偽値項目はTINYINT(1)で保持します。デフォルトなしの必須項目は登録時に値を指定します。</w:t>
       </w:r>
     </w:p>
     <w:p>
@@ -1775,7 +1775,7 @@
                 <w:b w:val="0"/>
                 <w:sz w:val="17"/>
               </w:rPr>
-              <w:t>BIGINT UNSIGNED</w:t>
+              <w:t>BIGINT(20) UNSIGNED</w:t>
             </w:r>
           </w:p>
         </w:tc>
@@ -2617,6 +2617,162 @@
                 <w:sz w:val="17"/>
               </w:rPr>
               <w:t>CURRENT_TIMESTAMP</w:t>
+            </w:r>
+          </w:p>
+        </w:tc>
+        <w:tc>
+          <w:tcPr>
+            <w:tcW w:type="dxa" w:w="2835"/>
+            <w:vAlign w:val="center"/>
+            <w:tcBorders>
+              <w:top w:val="single" w:sz="4" w:color="D9D9D9"/>
+              <w:left w:val="single" w:sz="4" w:color="D9D9D9"/>
+              <w:bottom w:val="single" w:sz="4" w:color="D9D9D9"/>
+              <w:right w:val="single" w:sz="4" w:color="D9D9D9"/>
+            </w:tcBorders>
+            <w:tcMar>
+              <w:top w:w="75" w:type="dxa"/>
+              <w:left w:w="75" w:type="dxa"/>
+              <w:bottom w:w="75" w:type="dxa"/>
+              <w:right w:w="75" w:type="dxa"/>
+            </w:tcMar>
+          </w:tcPr>
+          <w:p>
+            <w:pPr>
+              <w:spacing w:after="40" w:before="40"/>
+            </w:pPr>
+            <w:r>
+              <w:rPr>
+                <w:b w:val="0"/>
+                <w:sz w:val="17"/>
+              </w:rPr>
+              <w:t>—</w:t>
+            </w:r>
+          </w:p>
+        </w:tc>
+      </w:tr>
+      <w:tr>
+        <w:trPr>
+          <w:cantSplit/>
+        </w:trPr>
+        <w:tc>
+          <w:tcPr>
+            <w:tcW w:type="dxa" w:w="2381"/>
+            <w:vAlign w:val="center"/>
+            <w:tcBorders>
+              <w:top w:val="single" w:sz="4" w:color="D9D9D9"/>
+              <w:left w:val="single" w:sz="4" w:color="D9D9D9"/>
+              <w:bottom w:val="single" w:sz="4" w:color="D9D9D9"/>
+              <w:right w:val="single" w:sz="4" w:color="D9D9D9"/>
+            </w:tcBorders>
+            <w:tcMar>
+              <w:top w:w="75" w:type="dxa"/>
+              <w:left w:w="75" w:type="dxa"/>
+              <w:bottom w:w="75" w:type="dxa"/>
+              <w:right w:w="75" w:type="dxa"/>
+            </w:tcMar>
+          </w:tcPr>
+          <w:p>
+            <w:pPr>
+              <w:spacing w:after="40" w:before="40"/>
+            </w:pPr>
+            <w:r>
+              <w:rPr>
+                <w:b w:val="0"/>
+                <w:sz w:val="17"/>
+              </w:rPr>
+              <w:t>admin</w:t>
+            </w:r>
+          </w:p>
+        </w:tc>
+        <w:tc>
+          <w:tcPr>
+            <w:tcW w:type="dxa" w:w="1814"/>
+            <w:vAlign w:val="center"/>
+            <w:tcBorders>
+              <w:top w:val="single" w:sz="4" w:color="D9D9D9"/>
+              <w:left w:val="single" w:sz="4" w:color="D9D9D9"/>
+              <w:bottom w:val="single" w:sz="4" w:color="D9D9D9"/>
+              <w:right w:val="single" w:sz="4" w:color="D9D9D9"/>
+            </w:tcBorders>
+            <w:tcMar>
+              <w:top w:w="75" w:type="dxa"/>
+              <w:left w:w="75" w:type="dxa"/>
+              <w:bottom w:w="75" w:type="dxa"/>
+              <w:right w:w="75" w:type="dxa"/>
+            </w:tcMar>
+          </w:tcPr>
+          <w:p>
+            <w:pPr>
+              <w:spacing w:after="40" w:before="40"/>
+            </w:pPr>
+            <w:r>
+              <w:rPr>
+                <w:b w:val="0"/>
+                <w:sz w:val="17"/>
+              </w:rPr>
+              <w:t>TINYINT(1)</w:t>
+            </w:r>
+          </w:p>
+        </w:tc>
+        <w:tc>
+          <w:tcPr>
+            <w:tcW w:type="dxa" w:w="567"/>
+            <w:vAlign w:val="center"/>
+            <w:tcBorders>
+              <w:top w:val="single" w:sz="4" w:color="D9D9D9"/>
+              <w:left w:val="single" w:sz="4" w:color="D9D9D9"/>
+              <w:bottom w:val="single" w:sz="4" w:color="D9D9D9"/>
+              <w:right w:val="single" w:sz="4" w:color="D9D9D9"/>
+            </w:tcBorders>
+            <w:tcMar>
+              <w:top w:w="75" w:type="dxa"/>
+              <w:left w:w="75" w:type="dxa"/>
+              <w:bottom w:w="75" w:type="dxa"/>
+              <w:right w:w="75" w:type="dxa"/>
+            </w:tcMar>
+          </w:tcPr>
+          <w:p>
+            <w:pPr>
+              <w:spacing w:after="40" w:before="40"/>
+              <w:jc w:val="center"/>
+            </w:pPr>
+            <w:r>
+              <w:rPr>
+                <w:b w:val="0"/>
+                <w:sz w:val="17"/>
+              </w:rPr>
+              <w:t>○</w:t>
+            </w:r>
+          </w:p>
+        </w:tc>
+        <w:tc>
+          <w:tcPr>
+            <w:tcW w:type="dxa" w:w="2494"/>
+            <w:vAlign w:val="center"/>
+            <w:tcBorders>
+              <w:top w:val="single" w:sz="4" w:color="D9D9D9"/>
+              <w:left w:val="single" w:sz="4" w:color="D9D9D9"/>
+              <w:bottom w:val="single" w:sz="4" w:color="D9D9D9"/>
+              <w:right w:val="single" w:sz="4" w:color="D9D9D9"/>
+            </w:tcBorders>
+            <w:tcMar>
+              <w:top w:w="75" w:type="dxa"/>
+              <w:left w:w="75" w:type="dxa"/>
+              <w:bottom w:w="75" w:type="dxa"/>
+              <w:right w:w="75" w:type="dxa"/>
+            </w:tcMar>
+          </w:tcPr>
+          <w:p>
+            <w:pPr>
+              <w:spacing w:after="40" w:before="40"/>
+            </w:pPr>
+            <w:r>
+              <w:rPr>
+                <w:b w:val="0"/>
+                <w:sz w:val="17"/>
+              </w:rPr>
+              <w:t>0</w:t>
             </w:r>
           </w:p>
         </w:tc>
@@ -2919,7 +3075,7 @@
                 <w:b w:val="0"/>
                 <w:sz w:val="17"/>
               </w:rPr>
-              <w:t>BIGINT UNSIGNED</w:t>
+              <w:t>BIGINT(20) UNSIGNED</w:t>
             </w:r>
           </w:p>
         </w:tc>
@@ -3594,7 +3750,7 @@
                 <w:b w:val="0"/>
                 <w:sz w:val="17"/>
               </w:rPr>
-              <w:t>BIGINT UNSIGNED</w:t>
+              <w:t>BIGINT(20) UNSIGNED</w:t>
             </w:r>
           </w:p>
         </w:tc>
@@ -4114,7 +4270,7 @@
                 <w:b w:val="0"/>
                 <w:sz w:val="17"/>
               </w:rPr>
-              <w:t>BIGINT UNSIGNED</w:t>
+              <w:t>BIGINT(20) UNSIGNED</w:t>
             </w:r>
           </w:p>
         </w:tc>
@@ -4790,7 +4946,7 @@
                 <w:b w:val="0"/>
                 <w:sz w:val="17"/>
               </w:rPr>
-              <w:t>BIGINT UNSIGNED</w:t>
+              <w:t>BIGINT(20) UNSIGNED</w:t>
             </w:r>
           </w:p>
         </w:tc>
@@ -5102,7 +5258,7 @@
                 <w:b w:val="0"/>
                 <w:sz w:val="17"/>
               </w:rPr>
-              <w:t>INT</w:t>
+              <w:t>INT(11)</w:t>
             </w:r>
           </w:p>
         </w:tc>
@@ -5475,7 +5631,7 @@
                 <w:b w:val="0"/>
                 <w:sz w:val="17"/>
               </w:rPr>
-              <w:t>BIGINT UNSIGNED</w:t>
+              <w:t>BIGINT(20) UNSIGNED</w:t>
             </w:r>
           </w:p>
         </w:tc>
@@ -5631,7 +5787,7 @@
                 <w:b w:val="0"/>
                 <w:sz w:val="17"/>
               </w:rPr>
-              <w:t>BIGINT UNSIGNED</w:t>
+              <w:t>BIGINT(20) UNSIGNED</w:t>
             </w:r>
           </w:p>
         </w:tc>
@@ -5786,7 +5942,7 @@
                 <w:b w:val="0"/>
                 <w:sz w:val="17"/>
               </w:rPr>
-              <w:t>BIGINT UNSIGNED</w:t>
+              <w:t>BIGINT(20) UNSIGNED</w:t>
             </w:r>
           </w:p>
         </w:tc>
@@ -6408,7 +6564,7 @@
                 <w:b w:val="0"/>
                 <w:sz w:val="17"/>
               </w:rPr>
-              <w:t>INT UNSIGNED</w:t>
+              <w:t>INT(10) UNSIGNED</w:t>
             </w:r>
           </w:p>
         </w:tc>
@@ -7282,7 +7438,7 @@
                 <w:b w:val="0"/>
                 <w:sz w:val="17"/>
               </w:rPr>
-              <w:t>BIGINT UNSIGNED</w:t>
+              <w:t>BIGINT(20) UNSIGNED</w:t>
             </w:r>
           </w:p>
         </w:tc>
@@ -7438,7 +7594,7 @@
                 <w:b w:val="0"/>
                 <w:sz w:val="17"/>
               </w:rPr>
-              <w:t>BIGINT UNSIGNED</w:t>
+              <w:t>BIGINT(20) UNSIGNED</w:t>
             </w:r>
           </w:p>
         </w:tc>
@@ -7976,7 +8132,7 @@
                 <w:b w:val="0"/>
                 <w:sz w:val="17"/>
               </w:rPr>
-              <w:t>BIGINT UNSIGNED</w:t>
+              <w:t>BIGINT(20) UNSIGNED</w:t>
             </w:r>
           </w:p>
         </w:tc>
@@ -8132,7 +8288,7 @@
                 <w:b w:val="0"/>
                 <w:sz w:val="17"/>
               </w:rPr>
-              <w:t>BIGINT UNSIGNED</w:t>
+              <w:t>BIGINT(20) UNSIGNED</w:t>
             </w:r>
           </w:p>
         </w:tc>
@@ -8670,7 +8826,7 @@
                 <w:b w:val="0"/>
                 <w:sz w:val="17"/>
               </w:rPr>
-              <w:t>BIGINT UNSIGNED</w:t>
+              <w:t>BIGINT(20) UNSIGNED</w:t>
             </w:r>
           </w:p>
         </w:tc>
@@ -8826,7 +8982,7 @@
                 <w:b w:val="0"/>
                 <w:sz w:val="17"/>
               </w:rPr>
-              <w:t>BIGINT UNSIGNED</w:t>
+              <w:t>BIGINT(20) UNSIGNED</w:t>
             </w:r>
           </w:p>
         </w:tc>
@@ -9675,7 +9831,7 @@
                 <w:b w:val="0"/>
                 <w:sz w:val="17"/>
               </w:rPr>
-              <w:t>BIGINT UNSIGNED</w:t>
+              <w:t>BIGINT(20) UNSIGNED</w:t>
             </w:r>
           </w:p>
         </w:tc>
@@ -10299,7 +10455,7 @@
                 <w:b w:val="0"/>
                 <w:sz w:val="17"/>
               </w:rPr>
-              <w:t>INT</w:t>
+              <w:t>INT(11)</w:t>
             </w:r>
           </w:p>
         </w:tc>
@@ -10455,7 +10611,7 @@
                 <w:b w:val="0"/>
                 <w:sz w:val="17"/>
               </w:rPr>
-              <w:t>INT</w:t>
+              <w:t>INT(11)</w:t>
             </w:r>
           </w:p>
         </w:tc>
@@ -10611,7 +10767,7 @@
                 <w:b w:val="0"/>
                 <w:sz w:val="17"/>
               </w:rPr>
-              <w:t>INT</w:t>
+              <w:t>INT(11)</w:t>
             </w:r>
           </w:p>
         </w:tc>
@@ -10975,7 +11131,7 @@
                 <w:b w:val="0"/>
                 <w:sz w:val="17"/>
               </w:rPr>
-              <w:t>BIGINT UNSIGNED</w:t>
+              <w:t>BIGINT(20) UNSIGNED</w:t>
             </w:r>
           </w:p>
         </w:tc>
@@ -11131,7 +11287,7 @@
                 <w:b w:val="0"/>
                 <w:sz w:val="17"/>
               </w:rPr>
-              <w:t>BIGINT UNSIGNED</w:t>
+              <w:t>BIGINT(20) UNSIGNED</w:t>
             </w:r>
           </w:p>
         </w:tc>
@@ -11287,7 +11443,7 @@
                 <w:b w:val="0"/>
                 <w:sz w:val="17"/>
               </w:rPr>
-              <w:t>TINYINT UNSIGNED</w:t>
+              <w:t>TINYINT(3) UNSIGNED</w:t>
             </w:r>
           </w:p>
         </w:tc>
@@ -11678,7 +11834,7 @@
                 <w:b w:val="0"/>
                 <w:sz w:val="17"/>
               </w:rPr>
-              <w:t>BIGINT UNSIGNED</w:t>
+              <w:t>BIGINT(20) UNSIGNED</w:t>
             </w:r>
           </w:p>
         </w:tc>
@@ -11834,7 +11990,7 @@
                 <w:b w:val="0"/>
                 <w:sz w:val="17"/>
               </w:rPr>
-              <w:t>BIGINT UNSIGNED</w:t>
+              <w:t>BIGINT(20) UNSIGNED</w:t>
             </w:r>
           </w:p>
         </w:tc>
@@ -11990,7 +12146,7 @@
                 <w:b w:val="0"/>
                 <w:sz w:val="17"/>
               </w:rPr>
-              <w:t>BIGINT UNSIGNED</w:t>
+              <w:t>BIGINT(20) UNSIGNED</w:t>
             </w:r>
           </w:p>
         </w:tc>
@@ -12146,7 +12302,7 @@
                 <w:b w:val="0"/>
                 <w:sz w:val="17"/>
               </w:rPr>
-              <w:t>BIGINT UNSIGNED</w:t>
+              <w:t>BIGINT(20) UNSIGNED</w:t>
             </w:r>
           </w:p>
         </w:tc>
@@ -12564,7 +12720,7 @@
                 <w:b w:val="0"/>
                 <w:sz w:val="17"/>
               </w:rPr>
-              <w:t>BIGINT UNSIGNED</w:t>
+              <w:t>BIGINT(20) UNSIGNED</w:t>
             </w:r>
           </w:p>
         </w:tc>
@@ -12720,7 +12876,7 @@
                 <w:b w:val="0"/>
                 <w:sz w:val="17"/>
               </w:rPr>
-              <w:t>BIGINT UNSIGNED</w:t>
+              <w:t>BIGINT(20) UNSIGNED</w:t>
             </w:r>
           </w:p>
         </w:tc>
@@ -13267,7 +13423,7 @@
                 <w:b w:val="0"/>
                 <w:sz w:val="17"/>
               </w:rPr>
-              <w:t>BIGINT UNSIGNED</w:t>
+              <w:t>BIGINT(20) UNSIGNED</w:t>
             </w:r>
           </w:p>
         </w:tc>
@@ -13423,7 +13579,7 @@
                 <w:b w:val="0"/>
                 <w:sz w:val="17"/>
               </w:rPr>
-              <w:t>BIGINT UNSIGNED</w:t>
+              <w:t>BIGINT(20) UNSIGNED</w:t>
             </w:r>
           </w:p>
         </w:tc>
@@ -13579,7 +13735,7 @@
                 <w:b w:val="0"/>
                 <w:sz w:val="17"/>
               </w:rPr>
-              <w:t>BIGINT UNSIGNED</w:t>
+              <w:t>BIGINT(20) UNSIGNED</w:t>
             </w:r>
           </w:p>
         </w:tc>
@@ -14291,7 +14447,7 @@
                 <w:b w:val="0"/>
                 <w:sz w:val="17"/>
               </w:rPr>
-              <w:t>BIGINT UNSIGNED</w:t>
+              <w:t>BIGINT(20) UNSIGNED</w:t>
             </w:r>
           </w:p>
         </w:tc>
@@ -14447,7 +14603,7 @@
                 <w:b w:val="0"/>
                 <w:sz w:val="17"/>
               </w:rPr>
-              <w:t>BIGINT UNSIGNED</w:t>
+              <w:t>BIGINT(20) UNSIGNED</w:t>
             </w:r>
           </w:p>
         </w:tc>
@@ -14994,7 +15150,7 @@
                 <w:b w:val="0"/>
                 <w:sz w:val="17"/>
               </w:rPr>
-              <w:t>BIGINT UNSIGNED</w:t>
+              <w:t>BIGINT(20) UNSIGNED</w:t>
             </w:r>
           </w:p>
         </w:tc>
@@ -15150,7 +15306,7 @@
                 <w:b w:val="0"/>
                 <w:sz w:val="17"/>
               </w:rPr>
-              <w:t>BIGINT UNSIGNED</w:t>
+              <w:t>BIGINT(20) UNSIGNED</w:t>
             </w:r>
           </w:p>
         </w:tc>
@@ -15306,7 +15462,7 @@
                 <w:b w:val="0"/>
                 <w:sz w:val="17"/>
               </w:rPr>
-              <w:t>TINYINT UNSIGNED</w:t>
+              <w:t>TINYINT(3) UNSIGNED</w:t>
             </w:r>
           </w:p>
         </w:tc>
@@ -15697,7 +15853,7 @@
                 <w:b w:val="0"/>
                 <w:sz w:val="17"/>
               </w:rPr>
-              <w:t>BIGINT UNSIGNED</w:t>
+              <w:t>BIGINT(20) UNSIGNED</w:t>
             </w:r>
           </w:p>
         </w:tc>
@@ -15853,7 +16009,7 @@
                 <w:b w:val="0"/>
                 <w:sz w:val="17"/>
               </w:rPr>
-              <w:t>BIGINT UNSIGNED</w:t>
+              <w:t>BIGINT(20) UNSIGNED</w:t>
             </w:r>
           </w:p>
         </w:tc>
@@ -16009,7 +16165,7 @@
                 <w:b w:val="0"/>
                 <w:sz w:val="17"/>
               </w:rPr>
-              <w:t>INT</w:t>
+              <w:t>INT(11)</w:t>
             </w:r>
           </w:p>
         </w:tc>
@@ -16400,7 +16556,7 @@
                 <w:b w:val="0"/>
                 <w:sz w:val="17"/>
               </w:rPr>
-              <w:t>BIGINT UNSIGNED</w:t>
+              <w:t>BIGINT(20) UNSIGNED</w:t>
             </w:r>
           </w:p>
         </w:tc>
@@ -16556,7 +16712,7 @@
                 <w:b w:val="0"/>
                 <w:sz w:val="17"/>
               </w:rPr>
-              <w:t>BIGINT UNSIGNED</w:t>
+              <w:t>BIGINT(20) UNSIGNED</w:t>
             </w:r>
           </w:p>
         </w:tc>
@@ -16712,7 +16868,7 @@
                 <w:b w:val="0"/>
                 <w:sz w:val="17"/>
               </w:rPr>
-              <w:t>BOOLEAN</w:t>
+              <w:t>TINYINT(1)</w:t>
             </w:r>
           </w:p>
         </w:tc>
@@ -16773,7 +16929,7 @@
                 <w:b w:val="0"/>
                 <w:sz w:val="17"/>
               </w:rPr>
-              <w:t>FALSE</w:t>
+              <w:t>0</w:t>
             </w:r>
           </w:p>
         </w:tc>
@@ -16868,7 +17024,7 @@
                 <w:b w:val="0"/>
                 <w:sz w:val="17"/>
               </w:rPr>
-              <w:t>TINYINT UNSIGNED</w:t>
+              <w:t>TINYINT(3) UNSIGNED</w:t>
             </w:r>
           </w:p>
         </w:tc>
@@ -17340,6 +17496,15 @@
       </w:pPr>
       <w:r>
         <w:t>5 機能と保存ルール</w:t>
+      </w:r>
+    </w:p>
+    <w:p>
+      <w:pPr>
+        <w:pStyle w:val="ListBullet"/>
+        <w:widowControl/>
+      </w:pPr>
+      <w:r>
+        <w:t>管理者権限：users.admin を真偽値として管理します。初期値0は一般ユーザー、1は管理者です。</w:t>
       </w:r>
     </w:p>
     <w:p>
@@ -18254,6 +18419,85 @@
       </w:pPr>
       <w:r>
         <w:t>CREATE DATABASE は同名DBがある場合に失敗します。既存DBの削除・変更はせず、未使用DB名で実行します。旧DB向けの差分SQLは型や照合順序が異なるため、本書の新規作成SQLと混在させないでください。アプリは ddl-auto=validate を使用し、起動時にエンティティとDB定義の整合性を検証します。</w:t>
+      </w:r>
+    </w:p>
+    <w:p>
+      <w:pPr>
+        <w:pStyle w:val="Heading1"/>
+        <w:widowControl/>
+      </w:pPr>
+      <w:r>
+        <w:t>8 実DB照合結果</w:t>
+      </w:r>
+    </w:p>
+    <w:p>
+      <w:pPr>
+        <w:widowControl/>
+      </w:pPr>
+      <w:r>
+        <w:t>調査先は指定された http://localhost:8081/phpmyadmin/index.php です。両DBの「構造」画面と「作成を表示する」で全テーブルの定義を確認しました。認証情報・メールアドレス・パスワードハッシュ等の実レコードは設計書に含めません。</w:t>
+      </w:r>
+    </w:p>
+    <w:p>
+      <w:pPr>
+        <w:pStyle w:val="ListBullet"/>
+        <w:widowControl/>
+      </w:pPr>
+      <w:r>
+        <w:t>issho_no_deai と newbooze はともに18テーブルです。CREATE定義は、テーブルごとのAUTO_INCREMENT現在値を除いて一致しました。データ内容は別です。</w:t>
+      </w:r>
+    </w:p>
+    <w:p>
+      <w:pPr>
+        <w:pStyle w:val="ListBullet"/>
+        <w:widowControl/>
+      </w:pPr>
+      <w:r>
+        <w:t>前版に不足していた users.admin を追加しました。実DBでは created_at の後に配置されています。現在の作成SQLでは password_hash の後に配置されており、列順が異なります。</w:t>
+      </w:r>
+    </w:p>
+    <w:p>
+      <w:pPr>
+        <w:pStyle w:val="ListBullet"/>
+        <w:widowControl/>
+      </w:pPr>
+      <w:r>
+        <w:t>sake_reviews.published の実型はTINYINT(1)、初期値は0です。SQLのBOOLEAN・FALSEと同等の真偽値表現です。</w:t>
+      </w:r>
+    </w:p>
+    <w:p>
+      <w:pPr>
+        <w:pStyle w:val="ListBullet"/>
+        <w:widowControl/>
+      </w:pPr>
+      <w:r>
+        <w:t>全23本の外部キー、主キー・一意キー・索引、レビュー評価の1〜5 CHECKを確認しました。前版の関係図と削除規則に変更はありません。</w:t>
+      </w:r>
+    </w:p>
+    <w:p>
+      <w:pPr>
+        <w:pStyle w:val="ListBullet"/>
+        <w:widowControl/>
+      </w:pPr>
+      <w:r>
+        <w:t>構造画面の表示行数は issho_no_deai が合計87行、newbooze が合計120行でした。InnoDBの表示行数は推定値であり、厳密なCOUNT集計ではありません。</w:t>
+      </w:r>
+    </w:p>
+    <w:p>
+      <w:pPr>
+        <w:pStyle w:val="ListBullet"/>
+        <w:widowControl/>
+      </w:pPr>
+      <w:r>
+        <w:t>issho_no_deai の構造画面では日本酒10行、酒種7行、タグ7行、設問4行、選択肢12行、酒蔵0行と表示されています。マスタの定義は確認済みですが、各商品の名称や価格等の全レコード内容は今回の構造調査の対象外です。</w:t>
+      </w:r>
+    </w:p>
+    <w:p>
+      <w:pPr>
+        <w:widowControl/>
+      </w:pPr>
+      <w:r>
+        <w:t>今後の定義変更時は、この設計書と新規作成SQL・差分SQLを同時に更新します。第6章の改善候補は提案であり、実DBには適用していません。</w:t>
       </w:r>
     </w:p>
     <w:sectPr>

</xml_diff>

<commit_message>
Document selection-based sake tag weights
</commit_message>
<xml_diff>
--- a/docs/DB_DESIGN.docx
+++ b/docs/DB_DESIGN.docx
@@ -7673,6 +7673,9 @@
       </w:pPr>
     </w:p>
     <w:p>
+      <w:pPr>
+        <w:keepNext/>
+      </w:pPr>
       <w:r>
         <w:t>一意制約・索引・値制約：</w:t>
       </w:r>
@@ -17820,6 +17823,15 @@
         </w:tc>
       </w:tr>
     </w:tbl>
+    <w:p>
+      <w:pPr>
+        <w:spacing w:before="120"/>
+      </w:pPr>
+      <w:r>
+        <w:rPr/>
+        <w:t>管理画面の新規登録では、N個のタグを選択順にN、N−1、…、1としてscoreへ保存します。3個なら3、2、1です。DBの初期値3、既存レコード、スキーマは変更しません。</w:t>
+      </w:r>
+    </w:p>
     <w:p>
       <w:pPr>
         <w:spacing w:after="40"/>

</xml_diff>

<commit_message>
Add branching six-question diagnosis and taste quadrant explanations
</commit_message>
<xml_diff>
--- a/docs/DB_DESIGN.docx
+++ b/docs/DB_DESIGN.docx
@@ -21157,20 +21157,12 @@
     </w:p>
     <w:p>
       <w:r>
-        <w:t xml:space="preserve">新規DB作成用SQLは </w:t>
+        <w:t>新規DB作成用SQLは create_issho_no_deai.sql、手順は RESET_DATABASE.md を参照してください。作成SQLには全19テーブルと日本酒10件、診断4問・選択肢12件、酒種・タグの初期データが含まれます。分岐診断を使用する場合は、その後にdata/diagnosis_branching.sqlで設問6問と選択肢18件を追加する（合計10問・30選択肢、1回の回答は6問）。既存行を保持し、DDLの変更はない。ユーザーや投稿・レビューの初期データはありません。酒蔵マスタは空です。</w:t>
       </w:r>
-      <w:r>
-        <w:t>create_issho_no_deai.sql</w:t>
-      </w:r>
-      <w:r>
-        <w:t xml:space="preserve">、手順は </w:t>
-      </w:r>
-      <w:r>
-        <w:t>RESET_DATABASE.md</w:t>
-      </w:r>
-      <w:r>
-        <w:t xml:space="preserve"> を参照してください。作成SQLには全19テーブルと日本酒10件、診断4問・選択肢12件、酒種・タグの初期データが含まれます。ユーザーや投稿・レビューの初期データはありません。酒蔵マスタは空です。</w:t>
-      </w:r>
+      <w:r/>
+      <w:r/>
+      <w:r/>
+      <w:r/>
     </w:p>
     <w:p>
       <w:r>

</xml_diff>

<commit_message>
Add email verification and local mailbox workflow
</commit_message>
<xml_diff>
--- a/docs/DB_DESIGN.docx
+++ b/docs/DB_DESIGN.docx
@@ -12,7 +12,7 @@
     </w:p>
     <w:p>
       <w:r>
-        <w:t>作成日：2026年10月3日　実DB確認日：2026年10月5日　現行DDL・コード照合日：2026年10月9日</w:t>
+        <w:t>作成日：2026年10月3日　実DB確認日：2026年10月5日　メール認証仕様更新日：2026年10月19日</w:t>
       </w:r>
     </w:p>
     <w:p>
@@ -25,7 +25,7 @@
     </w:p>
     <w:p>
       <w:r>
-        <w:t>本書は NewBooze（日本酒紹介・好み診断アプリ）の現行DB構造を示す設計書です。2026年10月5日に指定のphpMyAdminへログインし、issho_no_deai と newbooze の全18テーブルのCREATE定義を確認しました。その後の現行DDLには sake_page_details が追加され、19テーブル・外部キー24本となっています。以下の定義は現行DDLに合わせ、過去の実DB照合結果は第8章に日付を明記して保持します。主な対象はローカル接続設定が指す issho_no_deai です。カラム・型・初期値・主キー・一意制約・索引・外部キー・削除規則・CHECK制約を実DBに照合し、保存ルールはアプリ実装を併せて参照しています。</w:t>
+        <w:t>本書は NewBooze（日本酒紹介・好み診断アプリ）のDB構造を示す設計書です。2026年10月5日に指定のphpMyAdminへログインし、issho_no_deai と newbooze の全18テーブルのCREATE定義を確認しました。その後の現行DDLには sake_page_details が追加され、19テーブル・外部キー24本となっています。2026年10月19日のメール認証仕様ではusersに4列と一意索引を追加し、テーブル数と外部キー数は変えません。以下は作成SQL・差分SQLに合わせた定義であり、今回の実DB適用・再照合を完了した記録ではありません。過去の実DB照合結果は第8章に日付を明記して保持します。主な対象はローカル接続設定が指す issho_no_deai です。</w:t>
       </w:r>
     </w:p>
     <w:p>
@@ -5118,6 +5118,630 @@
           </w:p>
         </w:tc>
       </w:tr>
+      <w:tr>
+        <w:trPr>
+          <w:cantSplit/>
+        </w:trPr>
+        <w:tc>
+          <w:tcPr>
+            <w:tcW w:type="dxa" w:w="1984"/>
+            <w:vAlign w:val="center"/>
+            <w:tcMar>
+              <w:top w:w="90" w:type="dxa"/>
+              <w:bottom w:w="90" w:type="dxa"/>
+              <w:left w:w="110" w:type="dxa"/>
+              <w:right w:w="110" w:type="dxa"/>
+            </w:tcMar>
+            <w:tcBorders>
+              <w:top w:val="single" w:sz="4" w:color="D9D9D9"/>
+              <w:bottom w:val="single" w:sz="4" w:color="D9D9D9"/>
+              <w:left w:val="single" w:sz="4" w:color="D9D9D9"/>
+              <w:right w:val="single" w:sz="4" w:color="D9D9D9"/>
+            </w:tcBorders>
+            <w:shd w:fill="F5F5F5"/>
+          </w:tcPr>
+          <w:p>
+            <w:pPr>
+              <w:spacing w:after="0" w:before="0" w:line="276" w:lineRule="auto"/>
+            </w:pPr>
+            <w:r>
+              <w:rPr>
+                <w:sz w:val="18"/>
+              </w:rPr>
+              <w:t>email_verified</w:t>
+            </w:r>
+          </w:p>
+        </w:tc>
+        <w:tc>
+          <w:tcPr>
+            <w:tcW w:type="dxa" w:w="1701"/>
+            <w:vAlign w:val="center"/>
+            <w:tcMar>
+              <w:top w:w="90" w:type="dxa"/>
+              <w:bottom w:w="90" w:type="dxa"/>
+              <w:left w:w="110" w:type="dxa"/>
+              <w:right w:w="110" w:type="dxa"/>
+            </w:tcMar>
+            <w:tcBorders>
+              <w:top w:val="single" w:sz="4" w:color="D9D9D9"/>
+              <w:bottom w:val="single" w:sz="4" w:color="D9D9D9"/>
+              <w:left w:val="single" w:sz="4" w:color="D9D9D9"/>
+              <w:right w:val="single" w:sz="4" w:color="D9D9D9"/>
+            </w:tcBorders>
+            <w:shd w:fill="F5F5F5"/>
+          </w:tcPr>
+          <w:p>
+            <w:pPr>
+              <w:spacing w:after="0" w:before="0" w:line="276" w:lineRule="auto"/>
+            </w:pPr>
+            <w:r>
+              <w:rPr>
+                <w:sz w:val="18"/>
+              </w:rPr>
+              <w:t>TINYINT(1)</w:t>
+            </w:r>
+          </w:p>
+        </w:tc>
+        <w:tc>
+          <w:tcPr>
+            <w:tcW w:type="dxa" w:w="680"/>
+            <w:vAlign w:val="center"/>
+            <w:tcMar>
+              <w:top w:w="90" w:type="dxa"/>
+              <w:bottom w:w="90" w:type="dxa"/>
+              <w:left w:w="110" w:type="dxa"/>
+              <w:right w:w="110" w:type="dxa"/>
+            </w:tcMar>
+            <w:tcBorders>
+              <w:top w:val="single" w:sz="4" w:color="D9D9D9"/>
+              <w:bottom w:val="single" w:sz="4" w:color="D9D9D9"/>
+              <w:left w:val="single" w:sz="4" w:color="D9D9D9"/>
+              <w:right w:val="single" w:sz="4" w:color="D9D9D9"/>
+            </w:tcBorders>
+            <w:shd w:fill="F5F5F5"/>
+          </w:tcPr>
+          <w:p>
+            <w:pPr>
+              <w:spacing w:after="0" w:before="0" w:line="276" w:lineRule="auto"/>
+              <w:jc w:val="center"/>
+            </w:pPr>
+            <w:r>
+              <w:rPr>
+                <w:sz w:val="18"/>
+              </w:rPr>
+              <w:t>○</w:t>
+            </w:r>
+          </w:p>
+        </w:tc>
+        <w:tc>
+          <w:tcPr>
+            <w:tcW w:type="dxa" w:w="2835"/>
+            <w:vAlign w:val="center"/>
+            <w:tcMar>
+              <w:top w:w="90" w:type="dxa"/>
+              <w:bottom w:w="90" w:type="dxa"/>
+              <w:left w:w="110" w:type="dxa"/>
+              <w:right w:w="110" w:type="dxa"/>
+            </w:tcMar>
+            <w:tcBorders>
+              <w:top w:val="single" w:sz="4" w:color="D9D9D9"/>
+              <w:bottom w:val="single" w:sz="4" w:color="D9D9D9"/>
+              <w:left w:val="single" w:sz="4" w:color="D9D9D9"/>
+              <w:right w:val="single" w:sz="4" w:color="D9D9D9"/>
+            </w:tcBorders>
+            <w:shd w:fill="F5F5F5"/>
+          </w:tcPr>
+          <w:p>
+            <w:pPr>
+              <w:spacing w:after="0" w:before="0" w:line="276" w:lineRule="auto"/>
+            </w:pPr>
+            <w:r>
+              <w:rPr>
+                <w:sz w:val="18"/>
+              </w:rPr>
+              <w:t>1</w:t>
+            </w:r>
+          </w:p>
+        </w:tc>
+        <w:tc>
+          <w:tcPr>
+            <w:tcW w:type="dxa" w:w="2438"/>
+            <w:vAlign w:val="center"/>
+            <w:tcMar>
+              <w:top w:w="90" w:type="dxa"/>
+              <w:bottom w:w="90" w:type="dxa"/>
+              <w:left w:w="110" w:type="dxa"/>
+              <w:right w:w="110" w:type="dxa"/>
+            </w:tcMar>
+            <w:tcBorders>
+              <w:top w:val="single" w:sz="4" w:color="D9D9D9"/>
+              <w:bottom w:val="single" w:sz="4" w:color="D9D9D9"/>
+              <w:left w:val="single" w:sz="4" w:color="D9D9D9"/>
+              <w:right w:val="single" w:sz="4" w:color="D9D9D9"/>
+            </w:tcBorders>
+            <w:shd w:fill="F5F5F5"/>
+          </w:tcPr>
+          <w:p>
+            <w:pPr>
+              <w:spacing w:after="0" w:before="0" w:line="276" w:lineRule="auto"/>
+            </w:pPr>
+            <w:r>
+              <w:rPr>
+                <w:sz w:val="18"/>
+              </w:rPr>
+              <w:t>—</w:t>
+            </w:r>
+          </w:p>
+        </w:tc>
+      </w:tr>
+      <w:tr>
+        <w:trPr>
+          <w:cantSplit/>
+        </w:trPr>
+        <w:tc>
+          <w:tcPr>
+            <w:tcW w:type="dxa" w:w="1984"/>
+            <w:vAlign w:val="center"/>
+            <w:tcMar>
+              <w:top w:w="90" w:type="dxa"/>
+              <w:bottom w:w="90" w:type="dxa"/>
+              <w:left w:w="110" w:type="dxa"/>
+              <w:right w:w="110" w:type="dxa"/>
+            </w:tcMar>
+            <w:tcBorders>
+              <w:top w:val="single" w:sz="4" w:color="D9D9D9"/>
+              <w:bottom w:val="single" w:sz="4" w:color="D9D9D9"/>
+              <w:left w:val="single" w:sz="4" w:color="D9D9D9"/>
+              <w:right w:val="single" w:sz="4" w:color="D9D9D9"/>
+            </w:tcBorders>
+            <w:shd w:fill="F5F5F5"/>
+          </w:tcPr>
+          <w:p>
+            <w:pPr>
+              <w:spacing w:after="0" w:before="0" w:line="276" w:lineRule="auto"/>
+            </w:pPr>
+            <w:r>
+              <w:rPr>
+                <w:sz w:val="18"/>
+              </w:rPr>
+              <w:t>email_verification_hash</w:t>
+            </w:r>
+          </w:p>
+        </w:tc>
+        <w:tc>
+          <w:tcPr>
+            <w:tcW w:type="dxa" w:w="1701"/>
+            <w:vAlign w:val="center"/>
+            <w:tcMar>
+              <w:top w:w="90" w:type="dxa"/>
+              <w:bottom w:w="90" w:type="dxa"/>
+              <w:left w:w="110" w:type="dxa"/>
+              <w:right w:w="110" w:type="dxa"/>
+            </w:tcMar>
+            <w:tcBorders>
+              <w:top w:val="single" w:sz="4" w:color="D9D9D9"/>
+              <w:bottom w:val="single" w:sz="4" w:color="D9D9D9"/>
+              <w:left w:val="single" w:sz="4" w:color="D9D9D9"/>
+              <w:right w:val="single" w:sz="4" w:color="D9D9D9"/>
+            </w:tcBorders>
+            <w:shd w:fill="F5F5F5"/>
+          </w:tcPr>
+          <w:p>
+            <w:pPr>
+              <w:spacing w:after="0" w:before="0" w:line="276" w:lineRule="auto"/>
+            </w:pPr>
+            <w:r>
+              <w:rPr>
+                <w:sz w:val="18"/>
+              </w:rPr>
+              <w:t>VARCHAR(64)</w:t>
+            </w:r>
+          </w:p>
+        </w:tc>
+        <w:tc>
+          <w:tcPr>
+            <w:tcW w:type="dxa" w:w="680"/>
+            <w:vAlign w:val="center"/>
+            <w:tcMar>
+              <w:top w:w="90" w:type="dxa"/>
+              <w:bottom w:w="90" w:type="dxa"/>
+              <w:left w:w="110" w:type="dxa"/>
+              <w:right w:w="110" w:type="dxa"/>
+            </w:tcMar>
+            <w:tcBorders>
+              <w:top w:val="single" w:sz="4" w:color="D9D9D9"/>
+              <w:bottom w:val="single" w:sz="4" w:color="D9D9D9"/>
+              <w:left w:val="single" w:sz="4" w:color="D9D9D9"/>
+              <w:right w:val="single" w:sz="4" w:color="D9D9D9"/>
+            </w:tcBorders>
+            <w:shd w:fill="F5F5F5"/>
+          </w:tcPr>
+          <w:p>
+            <w:pPr>
+              <w:spacing w:after="0" w:before="0" w:line="276" w:lineRule="auto"/>
+              <w:jc w:val="center"/>
+            </w:pPr>
+            <w:r>
+              <w:rPr>
+                <w:sz w:val="18"/>
+              </w:rPr>
+              <w:t>—</w:t>
+            </w:r>
+          </w:p>
+        </w:tc>
+        <w:tc>
+          <w:tcPr>
+            <w:tcW w:type="dxa" w:w="2835"/>
+            <w:vAlign w:val="center"/>
+            <w:tcMar>
+              <w:top w:w="90" w:type="dxa"/>
+              <w:bottom w:w="90" w:type="dxa"/>
+              <w:left w:w="110" w:type="dxa"/>
+              <w:right w:w="110" w:type="dxa"/>
+            </w:tcMar>
+            <w:tcBorders>
+              <w:top w:val="single" w:sz="4" w:color="D9D9D9"/>
+              <w:bottom w:val="single" w:sz="4" w:color="D9D9D9"/>
+              <w:left w:val="single" w:sz="4" w:color="D9D9D9"/>
+              <w:right w:val="single" w:sz="4" w:color="D9D9D9"/>
+            </w:tcBorders>
+            <w:shd w:fill="F5F5F5"/>
+          </w:tcPr>
+          <w:p>
+            <w:pPr>
+              <w:spacing w:after="0" w:before="0" w:line="276" w:lineRule="auto"/>
+            </w:pPr>
+            <w:r>
+              <w:rPr>
+                <w:sz w:val="18"/>
+              </w:rPr>
+              <w:t>NULL</w:t>
+            </w:r>
+          </w:p>
+        </w:tc>
+        <w:tc>
+          <w:tcPr>
+            <w:tcW w:type="dxa" w:w="2438"/>
+            <w:vAlign w:val="center"/>
+            <w:tcMar>
+              <w:top w:w="90" w:type="dxa"/>
+              <w:bottom w:w="90" w:type="dxa"/>
+              <w:left w:w="110" w:type="dxa"/>
+              <w:right w:w="110" w:type="dxa"/>
+            </w:tcMar>
+            <w:tcBorders>
+              <w:top w:val="single" w:sz="4" w:color="D9D9D9"/>
+              <w:bottom w:val="single" w:sz="4" w:color="D9D9D9"/>
+              <w:left w:val="single" w:sz="4" w:color="D9D9D9"/>
+              <w:right w:val="single" w:sz="4" w:color="D9D9D9"/>
+            </w:tcBorders>
+            <w:shd w:fill="F5F5F5"/>
+          </w:tcPr>
+          <w:p>
+            <w:pPr>
+              <w:spacing w:after="0" w:before="0" w:line="276" w:lineRule="auto"/>
+            </w:pPr>
+            <w:r>
+              <w:rPr>
+                <w:sz w:val="18"/>
+              </w:rPr>
+              <w:t>UK</w:t>
+            </w:r>
+          </w:p>
+        </w:tc>
+      </w:tr>
+      <w:tr>
+        <w:trPr>
+          <w:cantSplit/>
+        </w:trPr>
+        <w:tc>
+          <w:tcPr>
+            <w:tcW w:type="dxa" w:w="1984"/>
+            <w:vAlign w:val="center"/>
+            <w:tcMar>
+              <w:top w:w="90" w:type="dxa"/>
+              <w:bottom w:w="90" w:type="dxa"/>
+              <w:left w:w="110" w:type="dxa"/>
+              <w:right w:w="110" w:type="dxa"/>
+            </w:tcMar>
+            <w:tcBorders>
+              <w:top w:val="single" w:sz="4" w:color="D9D9D9"/>
+              <w:bottom w:val="single" w:sz="4" w:color="D9D9D9"/>
+              <w:left w:val="single" w:sz="4" w:color="D9D9D9"/>
+              <w:right w:val="single" w:sz="4" w:color="D9D9D9"/>
+            </w:tcBorders>
+            <w:shd w:fill="F5F5F5"/>
+          </w:tcPr>
+          <w:p>
+            <w:pPr>
+              <w:spacing w:after="0" w:before="0" w:line="276" w:lineRule="auto"/>
+            </w:pPr>
+            <w:r>
+              <w:rPr>
+                <w:sz w:val="18"/>
+              </w:rPr>
+              <w:t>email_verification_expires_at</w:t>
+            </w:r>
+          </w:p>
+        </w:tc>
+        <w:tc>
+          <w:tcPr>
+            <w:tcW w:type="dxa" w:w="1701"/>
+            <w:vAlign w:val="center"/>
+            <w:tcMar>
+              <w:top w:w="90" w:type="dxa"/>
+              <w:bottom w:w="90" w:type="dxa"/>
+              <w:left w:w="110" w:type="dxa"/>
+              <w:right w:w="110" w:type="dxa"/>
+            </w:tcMar>
+            <w:tcBorders>
+              <w:top w:val="single" w:sz="4" w:color="D9D9D9"/>
+              <w:bottom w:val="single" w:sz="4" w:color="D9D9D9"/>
+              <w:left w:val="single" w:sz="4" w:color="D9D9D9"/>
+              <w:right w:val="single" w:sz="4" w:color="D9D9D9"/>
+            </w:tcBorders>
+            <w:shd w:fill="F5F5F5"/>
+          </w:tcPr>
+          <w:p>
+            <w:pPr>
+              <w:spacing w:after="0" w:before="0" w:line="276" w:lineRule="auto"/>
+            </w:pPr>
+            <w:r>
+              <w:rPr>
+                <w:sz w:val="18"/>
+              </w:rPr>
+              <w:t>DATETIME</w:t>
+            </w:r>
+          </w:p>
+        </w:tc>
+        <w:tc>
+          <w:tcPr>
+            <w:tcW w:type="dxa" w:w="680"/>
+            <w:vAlign w:val="center"/>
+            <w:tcMar>
+              <w:top w:w="90" w:type="dxa"/>
+              <w:bottom w:w="90" w:type="dxa"/>
+              <w:left w:w="110" w:type="dxa"/>
+              <w:right w:w="110" w:type="dxa"/>
+            </w:tcMar>
+            <w:tcBorders>
+              <w:top w:val="single" w:sz="4" w:color="D9D9D9"/>
+              <w:bottom w:val="single" w:sz="4" w:color="D9D9D9"/>
+              <w:left w:val="single" w:sz="4" w:color="D9D9D9"/>
+              <w:right w:val="single" w:sz="4" w:color="D9D9D9"/>
+            </w:tcBorders>
+            <w:shd w:fill="F5F5F5"/>
+          </w:tcPr>
+          <w:p>
+            <w:pPr>
+              <w:spacing w:after="0" w:before="0" w:line="276" w:lineRule="auto"/>
+              <w:jc w:val="center"/>
+            </w:pPr>
+            <w:r>
+              <w:rPr>
+                <w:sz w:val="18"/>
+              </w:rPr>
+              <w:t>—</w:t>
+            </w:r>
+          </w:p>
+        </w:tc>
+        <w:tc>
+          <w:tcPr>
+            <w:tcW w:type="dxa" w:w="2835"/>
+            <w:vAlign w:val="center"/>
+            <w:tcMar>
+              <w:top w:w="90" w:type="dxa"/>
+              <w:bottom w:w="90" w:type="dxa"/>
+              <w:left w:w="110" w:type="dxa"/>
+              <w:right w:w="110" w:type="dxa"/>
+            </w:tcMar>
+            <w:tcBorders>
+              <w:top w:val="single" w:sz="4" w:color="D9D9D9"/>
+              <w:bottom w:val="single" w:sz="4" w:color="D9D9D9"/>
+              <w:left w:val="single" w:sz="4" w:color="D9D9D9"/>
+              <w:right w:val="single" w:sz="4" w:color="D9D9D9"/>
+            </w:tcBorders>
+            <w:shd w:fill="F5F5F5"/>
+          </w:tcPr>
+          <w:p>
+            <w:pPr>
+              <w:spacing w:after="0" w:before="0" w:line="276" w:lineRule="auto"/>
+            </w:pPr>
+            <w:r>
+              <w:rPr>
+                <w:sz w:val="18"/>
+              </w:rPr>
+              <w:t>NULL</w:t>
+            </w:r>
+          </w:p>
+        </w:tc>
+        <w:tc>
+          <w:tcPr>
+            <w:tcW w:type="dxa" w:w="2438"/>
+            <w:vAlign w:val="center"/>
+            <w:tcMar>
+              <w:top w:w="90" w:type="dxa"/>
+              <w:bottom w:w="90" w:type="dxa"/>
+              <w:left w:w="110" w:type="dxa"/>
+              <w:right w:w="110" w:type="dxa"/>
+            </w:tcMar>
+            <w:tcBorders>
+              <w:top w:val="single" w:sz="4" w:color="D9D9D9"/>
+              <w:bottom w:val="single" w:sz="4" w:color="D9D9D9"/>
+              <w:left w:val="single" w:sz="4" w:color="D9D9D9"/>
+              <w:right w:val="single" w:sz="4" w:color="D9D9D9"/>
+            </w:tcBorders>
+            <w:shd w:fill="F5F5F5"/>
+          </w:tcPr>
+          <w:p>
+            <w:pPr>
+              <w:spacing w:after="0" w:before="0" w:line="276" w:lineRule="auto"/>
+            </w:pPr>
+            <w:r>
+              <w:rPr>
+                <w:sz w:val="18"/>
+              </w:rPr>
+              <w:t>—</w:t>
+            </w:r>
+          </w:p>
+        </w:tc>
+      </w:tr>
+      <w:tr>
+        <w:trPr>
+          <w:cantSplit/>
+        </w:trPr>
+        <w:tc>
+          <w:tcPr>
+            <w:tcW w:type="dxa" w:w="1984"/>
+            <w:vAlign w:val="center"/>
+            <w:tcMar>
+              <w:top w:w="90" w:type="dxa"/>
+              <w:bottom w:w="90" w:type="dxa"/>
+              <w:left w:w="110" w:type="dxa"/>
+              <w:right w:w="110" w:type="dxa"/>
+            </w:tcMar>
+            <w:tcBorders>
+              <w:top w:val="single" w:sz="4" w:color="D9D9D9"/>
+              <w:bottom w:val="single" w:sz="4" w:color="D9D9D9"/>
+              <w:left w:val="single" w:sz="4" w:color="D9D9D9"/>
+              <w:right w:val="single" w:sz="4" w:color="D9D9D9"/>
+            </w:tcBorders>
+            <w:shd w:fill="F5F5F5"/>
+          </w:tcPr>
+          <w:p>
+            <w:pPr>
+              <w:spacing w:after="0" w:before="0" w:line="276" w:lineRule="auto"/>
+            </w:pPr>
+            <w:r>
+              <w:rPr>
+                <w:sz w:val="18"/>
+              </w:rPr>
+              <w:t>email_verification_sent_at</w:t>
+            </w:r>
+          </w:p>
+        </w:tc>
+        <w:tc>
+          <w:tcPr>
+            <w:tcW w:type="dxa" w:w="1701"/>
+            <w:vAlign w:val="center"/>
+            <w:tcMar>
+              <w:top w:w="90" w:type="dxa"/>
+              <w:bottom w:w="90" w:type="dxa"/>
+              <w:left w:w="110" w:type="dxa"/>
+              <w:right w:w="110" w:type="dxa"/>
+            </w:tcMar>
+            <w:tcBorders>
+              <w:top w:val="single" w:sz="4" w:color="D9D9D9"/>
+              <w:bottom w:val="single" w:sz="4" w:color="D9D9D9"/>
+              <w:left w:val="single" w:sz="4" w:color="D9D9D9"/>
+              <w:right w:val="single" w:sz="4" w:color="D9D9D9"/>
+            </w:tcBorders>
+            <w:shd w:fill="F5F5F5"/>
+          </w:tcPr>
+          <w:p>
+            <w:pPr>
+              <w:spacing w:after="0" w:before="0" w:line="276" w:lineRule="auto"/>
+            </w:pPr>
+            <w:r>
+              <w:rPr>
+                <w:sz w:val="18"/>
+              </w:rPr>
+              <w:t>DATETIME</w:t>
+            </w:r>
+          </w:p>
+        </w:tc>
+        <w:tc>
+          <w:tcPr>
+            <w:tcW w:type="dxa" w:w="680"/>
+            <w:vAlign w:val="center"/>
+            <w:tcMar>
+              <w:top w:w="90" w:type="dxa"/>
+              <w:bottom w:w="90" w:type="dxa"/>
+              <w:left w:w="110" w:type="dxa"/>
+              <w:right w:w="110" w:type="dxa"/>
+            </w:tcMar>
+            <w:tcBorders>
+              <w:top w:val="single" w:sz="4" w:color="D9D9D9"/>
+              <w:bottom w:val="single" w:sz="4" w:color="D9D9D9"/>
+              <w:left w:val="single" w:sz="4" w:color="D9D9D9"/>
+              <w:right w:val="single" w:sz="4" w:color="D9D9D9"/>
+            </w:tcBorders>
+            <w:shd w:fill="F5F5F5"/>
+          </w:tcPr>
+          <w:p>
+            <w:pPr>
+              <w:spacing w:after="0" w:before="0" w:line="276" w:lineRule="auto"/>
+              <w:jc w:val="center"/>
+            </w:pPr>
+            <w:r>
+              <w:rPr>
+                <w:sz w:val="18"/>
+              </w:rPr>
+              <w:t>—</w:t>
+            </w:r>
+          </w:p>
+        </w:tc>
+        <w:tc>
+          <w:tcPr>
+            <w:tcW w:type="dxa" w:w="2835"/>
+            <w:vAlign w:val="center"/>
+            <w:tcMar>
+              <w:top w:w="90" w:type="dxa"/>
+              <w:bottom w:w="90" w:type="dxa"/>
+              <w:left w:w="110" w:type="dxa"/>
+              <w:right w:w="110" w:type="dxa"/>
+            </w:tcMar>
+            <w:tcBorders>
+              <w:top w:val="single" w:sz="4" w:color="D9D9D9"/>
+              <w:bottom w:val="single" w:sz="4" w:color="D9D9D9"/>
+              <w:left w:val="single" w:sz="4" w:color="D9D9D9"/>
+              <w:right w:val="single" w:sz="4" w:color="D9D9D9"/>
+            </w:tcBorders>
+            <w:shd w:fill="F5F5F5"/>
+          </w:tcPr>
+          <w:p>
+            <w:pPr>
+              <w:spacing w:after="0" w:before="0" w:line="276" w:lineRule="auto"/>
+            </w:pPr>
+            <w:r>
+              <w:rPr>
+                <w:sz w:val="18"/>
+              </w:rPr>
+              <w:t>NULL</w:t>
+            </w:r>
+          </w:p>
+        </w:tc>
+        <w:tc>
+          <w:tcPr>
+            <w:tcW w:type="dxa" w:w="2438"/>
+            <w:vAlign w:val="center"/>
+            <w:tcMar>
+              <w:top w:w="90" w:type="dxa"/>
+              <w:bottom w:w="90" w:type="dxa"/>
+              <w:left w:w="110" w:type="dxa"/>
+              <w:right w:w="110" w:type="dxa"/>
+            </w:tcMar>
+            <w:tcBorders>
+              <w:top w:val="single" w:sz="4" w:color="D9D9D9"/>
+              <w:bottom w:val="single" w:sz="4" w:color="D9D9D9"/>
+              <w:left w:val="single" w:sz="4" w:color="D9D9D9"/>
+              <w:right w:val="single" w:sz="4" w:color="D9D9D9"/>
+            </w:tcBorders>
+            <w:shd w:fill="F5F5F5"/>
+          </w:tcPr>
+          <w:p>
+            <w:pPr>
+              <w:spacing w:after="0" w:before="0" w:line="276" w:lineRule="auto"/>
+            </w:pPr>
+            <w:r>
+              <w:rPr>
+                <w:sz w:val="18"/>
+              </w:rPr>
+              <w:t>—</w:t>
+            </w:r>
+          </w:p>
+        </w:tc>
+      </w:tr>
     </w:tbl>
     <w:p>
       <w:pPr>
@@ -5135,6 +5759,26 @@
       </w:pPr>
       <w:r>
         <w:t>UNIQUE KEY uk_users_email (email)</w:t>
+      </w:r>
+    </w:p>
+    <w:p>
+      <w:pPr>
+        <w:pStyle w:val="ListBullet"/>
+      </w:pPr>
+      <w:pPr>
+        <w:pStyle w:val="ListBullet"/>
+      </w:pPr>
+      <w:r>
+        <w:t>UNIQUE KEY uk_users_email_verification_hash (email_verification_hash)</w:t>
+      </w:r>
+    </w:p>
+    <w:p>
+      <w:pPr>
+        <w:pStyle w:val="ListBullet"/>
+      </w:pPr>
+      <w:pPr/>
+      <w:r>
+        <w:t>email_verified の初期値1は既存ユーザーの利用継続のためです。新規登録Serviceは0を明示し、メール内の確認操作が完了するまでログインを許可しません。認証待ちの値だけを一意にするため、トークンハッシュはNULLを許容します。</w:t>
       </w:r>
     </w:p>
     <w:p>
@@ -20274,7 +20918,29 @@
         <w:pStyle w:val="ListBullet"/>
       </w:pPr>
       <w:r>
-        <w:t>会員登録：メールアドレスは一意。パスワードは password_hash にハッシュを保存し、仮パスワード状態は temporary_password で管理します。</w:t>
+        <w:t>会員登録：メールアドレスは一意。パスワードは password_hash にハッシュを保存し、仮パスワード状態は temporary_password で管理します。新規会員はアプリが email_verified=0 を明示し、SMTP送信まで同じトランザクションで行います。送信失敗時は登録を取り消します。</w:t>
+      </w:r>
+    </w:p>
+    <w:p>
+      <w:pPr>
+        <w:pStyle w:val="ListBullet"/>
+      </w:pPr>
+      <w:pPr>
+        <w:pStyle w:val="ListBullet"/>
+      </w:pPr>
+      <w:r>
+        <w:t>メール認証：32バイト乱数から作る43文字のURL-safeトークンはメールだけに載せ、SHA-256の64文字ハッシュを保存します。有効期間は24時間で、一度の確定後にハッシュ・期限・送信日時を消去します。認証確定と再送はusers行をロックして処理します。再送は未認証かつ60秒以上経過した場合だけ行い、成功時に古いトークンを無効にします。</w:t>
+      </w:r>
+    </w:p>
+    <w:p>
+      <w:pPr>
+        <w:pStyle w:val="ListBullet"/>
+      </w:pPr>
+      <w:pPr>
+        <w:pStyle w:val="ListBullet"/>
+      </w:pPr>
+      <w:r>
+        <w:t>メール変更：未認証化と新しいメールアドレスへのSMTP送信を同じトランザクションに含めます。失敗時は元のメールアドレス・認証状態・トークン情報を保持します。送信成功時はログアウトし、認証後にログインします。仮パスワード再発行で認証状態は変更しません。</w:t>
       </w:r>
     </w:p>
     <w:p>
@@ -21171,7 +21837,7 @@
     </w:p>
     <w:p>
       <w:r>
-        <w:t>既存DBで詳細紹介テーブルがない場合は data/sake_page_details_schema.sql を適用します。初心者ガイドはHTML、メジャー候補はmajor-sake.jsonで管理するため、その追加に伴うDB構造変更はありません。</w:t>
+        <w:t>既存DBで詳細紹介テーブルがない場合は data/sake_page_details_schema.sql を適用します。メール認証を追加する既存DBでは、接続先を確認し、バックアップ後、アプリ起動前に data/email_verification_schema.sql を適用します。既存ユーザーは email_verified=1 の初期値で保持します。新規作成SQLにも同じ4列と一意索引を含めます。初期管理者はアプリから認証済みで作ります。適用手順と確認項目は docs/email-verification.md を参照してください。初心者ガイドとメジャー候補の追加に伴うDB構造変更はありません。</w:t>
       </w:r>
     </w:p>
     <w:p>

</xml_diff>

<commit_message>
Harden account recovery, administrator setup, and image validation
</commit_message>
<xml_diff>
--- a/docs/DB_DESIGN.docx
+++ b/docs/DB_DESIGN.docx
@@ -12,7 +12,7 @@
     </w:p>
     <w:p>
       <w:r>
-        <w:t>作成日：2026年10月3日　実DB確認日：2026年10月5日　メール認証仕様更新日：2026年10月19日</w:t>
+        <w:t>作成日：2026年10月3日　実DB確認日：2026年10月5日　メール認証仕様更新日：2026年10月19日　安全対策のコード・DDL更新日：2026年10月21日</w:t>
       </w:r>
     </w:p>
     <w:p>
@@ -25,7 +25,7 @@
     </w:p>
     <w:p>
       <w:r>
-        <w:t>本書は NewBooze（日本酒紹介・好み診断アプリ）のDB構造を示す設計書です。2026年10月5日に指定のphpMyAdminへログインし、issho_no_deai と newbooze の全18テーブルのCREATE定義を確認しました。その後の現行DDLには sake_page_details が追加され、19テーブル・外部キー24本となっています。2026年10月19日のメール認証仕様ではusersに4列と一意索引を追加し、テーブル数と外部キー数は変えません。以下は作成SQL・差分SQLに合わせた定義であり、今回の実DB適用・再照合を完了した記録ではありません。過去の実DB照合結果は第8章に日付を明記して保持します。主な対象はローカル接続設定が指す issho_no_deai です。</w:t>
+        <w:t>本書は NewBooze（日本酒紹介・好み診断アプリ）のDB構造を示す設計書です。2026年10月5日に指定のphpMyAdminへログインし、issho_no_deai と newbooze の全18テーブルのCREATE定義を確認しました。その後の現行DDLには sake_page_details が追加され、19テーブル・外部キー24本となっています。2026年10月19日のメール認証仕様ではusersに4列と一意索引、2026年10月21日のパスワード再設定仕様ではNULL許容3列と一意索引を追加し、テーブル数と外部キー数は変えません。以下は作成SQL・差分SQLに合わせた定義であり、今回の実DB適用・再照合を完了した記録ではありません。過去の実DB照合結果は第8章に日付を明記して保持します。主な対象はローカル接続設定が指す issho_no_deai です。</w:t>
       </w:r>
     </w:p>
     <w:p>
@@ -5742,6 +5742,420 @@
           </w:p>
         </w:tc>
       </w:tr>
+      <w:tr>
+        <w:trPr>
+          <w:cantSplit/>
+        </w:trPr>
+        <w:tc>
+          <w:tcPr>
+            <w:tcW w:type="dxa" w:w="1984"/>
+            <w:vAlign w:val="center"/>
+            <w:tcMar>
+              <w:top w:w="90" w:type="dxa"/>
+              <w:bottom w:w="90" w:type="dxa"/>
+              <w:left w:w="110" w:type="dxa"/>
+              <w:right w:w="110" w:type="dxa"/>
+            </w:tcMar>
+            <w:tcBorders>
+              <w:top w:val="single" w:sz="4" w:color="D9D9D9"/>
+              <w:bottom w:val="single" w:sz="4" w:color="D9D9D9"/>
+              <w:left w:val="single" w:sz="4" w:color="D9D9D9"/>
+              <w:right w:val="single" w:sz="4" w:color="D9D9D9"/>
+            </w:tcBorders>
+            <w:shd w:fill="F5F5F5"/>
+          </w:tcPr>
+          <w:p>
+            <w:r>
+              <w:t>password_reset_hash</w:t>
+            </w:r>
+          </w:p>
+        </w:tc>
+        <w:tc>
+          <w:tcPr>
+            <w:tcW w:type="dxa" w:w="1701"/>
+            <w:vAlign w:val="center"/>
+            <w:tcMar>
+              <w:top w:w="90" w:type="dxa"/>
+              <w:bottom w:w="90" w:type="dxa"/>
+              <w:left w:w="110" w:type="dxa"/>
+              <w:right w:w="110" w:type="dxa"/>
+            </w:tcMar>
+            <w:tcBorders>
+              <w:top w:val="single" w:sz="4" w:color="D9D9D9"/>
+              <w:bottom w:val="single" w:sz="4" w:color="D9D9D9"/>
+              <w:left w:val="single" w:sz="4" w:color="D9D9D9"/>
+              <w:right w:val="single" w:sz="4" w:color="D9D9D9"/>
+            </w:tcBorders>
+            <w:shd w:fill="F5F5F5"/>
+          </w:tcPr>
+          <w:p>
+            <w:r>
+              <w:t>VARCHAR(64)</w:t>
+            </w:r>
+          </w:p>
+        </w:tc>
+        <w:tc>
+          <w:tcPr>
+            <w:tcW w:type="dxa" w:w="680"/>
+            <w:vAlign w:val="center"/>
+            <w:tcMar>
+              <w:top w:w="90" w:type="dxa"/>
+              <w:bottom w:w="90" w:type="dxa"/>
+              <w:left w:w="110" w:type="dxa"/>
+              <w:right w:w="110" w:type="dxa"/>
+            </w:tcMar>
+            <w:tcBorders>
+              <w:top w:val="single" w:sz="4" w:color="D9D9D9"/>
+              <w:bottom w:val="single" w:sz="4" w:color="D9D9D9"/>
+              <w:left w:val="single" w:sz="4" w:color="D9D9D9"/>
+              <w:right w:val="single" w:sz="4" w:color="D9D9D9"/>
+            </w:tcBorders>
+            <w:shd w:fill="F5F5F5"/>
+          </w:tcPr>
+          <w:p>
+            <w:pPr>
+              <w:spacing w:after="0" w:before="0" w:line="276" w:lineRule="auto"/>
+              <w:jc w:val="center"/>
+            </w:pPr>
+            <w:r>
+              <w:rPr>
+                <w:sz w:val="18"/>
+              </w:rPr>
+              <w:t>—</w:t>
+            </w:r>
+          </w:p>
+        </w:tc>
+        <w:tc>
+          <w:tcPr>
+            <w:tcW w:type="dxa" w:w="2835"/>
+            <w:vAlign w:val="center"/>
+            <w:tcMar>
+              <w:top w:w="90" w:type="dxa"/>
+              <w:bottom w:w="90" w:type="dxa"/>
+              <w:left w:w="110" w:type="dxa"/>
+              <w:right w:w="110" w:type="dxa"/>
+            </w:tcMar>
+            <w:tcBorders>
+              <w:top w:val="single" w:sz="4" w:color="D9D9D9"/>
+              <w:bottom w:val="single" w:sz="4" w:color="D9D9D9"/>
+              <w:left w:val="single" w:sz="4" w:color="D9D9D9"/>
+              <w:right w:val="single" w:sz="4" w:color="D9D9D9"/>
+            </w:tcBorders>
+            <w:shd w:fill="F5F5F5"/>
+          </w:tcPr>
+          <w:p>
+            <w:pPr>
+              <w:spacing w:after="0" w:before="0" w:line="276" w:lineRule="auto"/>
+            </w:pPr>
+            <w:r>
+              <w:rPr>
+                <w:sz w:val="18"/>
+              </w:rPr>
+              <w:t>NULL</w:t>
+            </w:r>
+          </w:p>
+        </w:tc>
+        <w:tc>
+          <w:tcPr>
+            <w:tcW w:type="dxa" w:w="2438"/>
+            <w:vAlign w:val="center"/>
+            <w:tcMar>
+              <w:top w:w="90" w:type="dxa"/>
+              <w:bottom w:w="90" w:type="dxa"/>
+              <w:left w:w="110" w:type="dxa"/>
+              <w:right w:w="110" w:type="dxa"/>
+            </w:tcMar>
+            <w:tcBorders>
+              <w:top w:val="single" w:sz="4" w:color="D9D9D9"/>
+              <w:bottom w:val="single" w:sz="4" w:color="D9D9D9"/>
+              <w:left w:val="single" w:sz="4" w:color="D9D9D9"/>
+              <w:right w:val="single" w:sz="4" w:color="D9D9D9"/>
+            </w:tcBorders>
+            <w:shd w:fill="F5F5F5"/>
+          </w:tcPr>
+          <w:p>
+            <w:r>
+              <w:t>UK</w:t>
+            </w:r>
+          </w:p>
+        </w:tc>
+      </w:tr>
+      <w:tr>
+        <w:trPr>
+          <w:cantSplit/>
+        </w:trPr>
+        <w:tc>
+          <w:tcPr>
+            <w:tcW w:type="dxa" w:w="1984"/>
+            <w:vAlign w:val="center"/>
+            <w:tcMar>
+              <w:top w:w="90" w:type="dxa"/>
+              <w:bottom w:w="90" w:type="dxa"/>
+              <w:left w:w="110" w:type="dxa"/>
+              <w:right w:w="110" w:type="dxa"/>
+            </w:tcMar>
+            <w:tcBorders>
+              <w:top w:val="single" w:sz="4" w:color="D9D9D9"/>
+              <w:bottom w:val="single" w:sz="4" w:color="D9D9D9"/>
+              <w:left w:val="single" w:sz="4" w:color="D9D9D9"/>
+              <w:right w:val="single" w:sz="4" w:color="D9D9D9"/>
+            </w:tcBorders>
+            <w:shd w:fill="F5F5F5"/>
+          </w:tcPr>
+          <w:p>
+            <w:r>
+              <w:t>password_reset_expires_at</w:t>
+            </w:r>
+          </w:p>
+        </w:tc>
+        <w:tc>
+          <w:tcPr>
+            <w:tcW w:type="dxa" w:w="1701"/>
+            <w:vAlign w:val="center"/>
+            <w:tcMar>
+              <w:top w:w="90" w:type="dxa"/>
+              <w:bottom w:w="90" w:type="dxa"/>
+              <w:left w:w="110" w:type="dxa"/>
+              <w:right w:w="110" w:type="dxa"/>
+            </w:tcMar>
+            <w:tcBorders>
+              <w:top w:val="single" w:sz="4" w:color="D9D9D9"/>
+              <w:bottom w:val="single" w:sz="4" w:color="D9D9D9"/>
+              <w:left w:val="single" w:sz="4" w:color="D9D9D9"/>
+              <w:right w:val="single" w:sz="4" w:color="D9D9D9"/>
+            </w:tcBorders>
+            <w:shd w:fill="F5F5F5"/>
+          </w:tcPr>
+          <w:p>
+            <w:r>
+              <w:t>DATETIME</w:t>
+            </w:r>
+          </w:p>
+        </w:tc>
+        <w:tc>
+          <w:tcPr>
+            <w:tcW w:type="dxa" w:w="680"/>
+            <w:vAlign w:val="center"/>
+            <w:tcMar>
+              <w:top w:w="90" w:type="dxa"/>
+              <w:bottom w:w="90" w:type="dxa"/>
+              <w:left w:w="110" w:type="dxa"/>
+              <w:right w:w="110" w:type="dxa"/>
+            </w:tcMar>
+            <w:tcBorders>
+              <w:top w:val="single" w:sz="4" w:color="D9D9D9"/>
+              <w:bottom w:val="single" w:sz="4" w:color="D9D9D9"/>
+              <w:left w:val="single" w:sz="4" w:color="D9D9D9"/>
+              <w:right w:val="single" w:sz="4" w:color="D9D9D9"/>
+            </w:tcBorders>
+            <w:shd w:fill="F5F5F5"/>
+          </w:tcPr>
+          <w:p>
+            <w:pPr>
+              <w:spacing w:after="0" w:before="0" w:line="276" w:lineRule="auto"/>
+              <w:jc w:val="center"/>
+            </w:pPr>
+            <w:r>
+              <w:rPr>
+                <w:sz w:val="18"/>
+              </w:rPr>
+              <w:t>—</w:t>
+            </w:r>
+          </w:p>
+        </w:tc>
+        <w:tc>
+          <w:tcPr>
+            <w:tcW w:type="dxa" w:w="2835"/>
+            <w:vAlign w:val="center"/>
+            <w:tcMar>
+              <w:top w:w="90" w:type="dxa"/>
+              <w:bottom w:w="90" w:type="dxa"/>
+              <w:left w:w="110" w:type="dxa"/>
+              <w:right w:w="110" w:type="dxa"/>
+            </w:tcMar>
+            <w:tcBorders>
+              <w:top w:val="single" w:sz="4" w:color="D9D9D9"/>
+              <w:bottom w:val="single" w:sz="4" w:color="D9D9D9"/>
+              <w:left w:val="single" w:sz="4" w:color="D9D9D9"/>
+              <w:right w:val="single" w:sz="4" w:color="D9D9D9"/>
+            </w:tcBorders>
+            <w:shd w:fill="F5F5F5"/>
+          </w:tcPr>
+          <w:p>
+            <w:pPr>
+              <w:spacing w:after="0" w:before="0" w:line="276" w:lineRule="auto"/>
+            </w:pPr>
+            <w:r>
+              <w:rPr>
+                <w:sz w:val="18"/>
+              </w:rPr>
+              <w:t>NULL</w:t>
+            </w:r>
+          </w:p>
+        </w:tc>
+        <w:tc>
+          <w:tcPr>
+            <w:tcW w:type="dxa" w:w="2438"/>
+            <w:vAlign w:val="center"/>
+            <w:tcMar>
+              <w:top w:w="90" w:type="dxa"/>
+              <w:bottom w:w="90" w:type="dxa"/>
+              <w:left w:w="110" w:type="dxa"/>
+              <w:right w:w="110" w:type="dxa"/>
+            </w:tcMar>
+            <w:tcBorders>
+              <w:top w:val="single" w:sz="4" w:color="D9D9D9"/>
+              <w:bottom w:val="single" w:sz="4" w:color="D9D9D9"/>
+              <w:left w:val="single" w:sz="4" w:color="D9D9D9"/>
+              <w:right w:val="single" w:sz="4" w:color="D9D9D9"/>
+            </w:tcBorders>
+            <w:shd w:fill="F5F5F5"/>
+          </w:tcPr>
+          <w:p>
+            <w:r>
+              <w:t>—</w:t>
+            </w:r>
+          </w:p>
+        </w:tc>
+      </w:tr>
+      <w:tr>
+        <w:trPr>
+          <w:cantSplit/>
+        </w:trPr>
+        <w:tc>
+          <w:tcPr>
+            <w:tcW w:type="dxa" w:w="1984"/>
+            <w:vAlign w:val="center"/>
+            <w:tcMar>
+              <w:top w:w="90" w:type="dxa"/>
+              <w:bottom w:w="90" w:type="dxa"/>
+              <w:left w:w="110" w:type="dxa"/>
+              <w:right w:w="110" w:type="dxa"/>
+            </w:tcMar>
+            <w:tcBorders>
+              <w:top w:val="single" w:sz="4" w:color="D9D9D9"/>
+              <w:bottom w:val="single" w:sz="4" w:color="D9D9D9"/>
+              <w:left w:val="single" w:sz="4" w:color="D9D9D9"/>
+              <w:right w:val="single" w:sz="4" w:color="D9D9D9"/>
+            </w:tcBorders>
+            <w:shd w:fill="F5F5F5"/>
+          </w:tcPr>
+          <w:p>
+            <w:r>
+              <w:t>password_reset_sent_at</w:t>
+            </w:r>
+          </w:p>
+        </w:tc>
+        <w:tc>
+          <w:tcPr>
+            <w:tcW w:type="dxa" w:w="1701"/>
+            <w:vAlign w:val="center"/>
+            <w:tcMar>
+              <w:top w:w="90" w:type="dxa"/>
+              <w:bottom w:w="90" w:type="dxa"/>
+              <w:left w:w="110" w:type="dxa"/>
+              <w:right w:w="110" w:type="dxa"/>
+            </w:tcMar>
+            <w:tcBorders>
+              <w:top w:val="single" w:sz="4" w:color="D9D9D9"/>
+              <w:bottom w:val="single" w:sz="4" w:color="D9D9D9"/>
+              <w:left w:val="single" w:sz="4" w:color="D9D9D9"/>
+              <w:right w:val="single" w:sz="4" w:color="D9D9D9"/>
+            </w:tcBorders>
+            <w:shd w:fill="F5F5F5"/>
+          </w:tcPr>
+          <w:p>
+            <w:r>
+              <w:t>DATETIME</w:t>
+            </w:r>
+          </w:p>
+        </w:tc>
+        <w:tc>
+          <w:tcPr>
+            <w:tcW w:type="dxa" w:w="680"/>
+            <w:vAlign w:val="center"/>
+            <w:tcMar>
+              <w:top w:w="90" w:type="dxa"/>
+              <w:bottom w:w="90" w:type="dxa"/>
+              <w:left w:w="110" w:type="dxa"/>
+              <w:right w:w="110" w:type="dxa"/>
+            </w:tcMar>
+            <w:tcBorders>
+              <w:top w:val="single" w:sz="4" w:color="D9D9D9"/>
+              <w:bottom w:val="single" w:sz="4" w:color="D9D9D9"/>
+              <w:left w:val="single" w:sz="4" w:color="D9D9D9"/>
+              <w:right w:val="single" w:sz="4" w:color="D9D9D9"/>
+            </w:tcBorders>
+            <w:shd w:fill="F5F5F5"/>
+          </w:tcPr>
+          <w:p>
+            <w:pPr>
+              <w:spacing w:after="0" w:before="0" w:line="276" w:lineRule="auto"/>
+              <w:jc w:val="center"/>
+            </w:pPr>
+            <w:r>
+              <w:rPr>
+                <w:sz w:val="18"/>
+              </w:rPr>
+              <w:t>—</w:t>
+            </w:r>
+          </w:p>
+        </w:tc>
+        <w:tc>
+          <w:tcPr>
+            <w:tcW w:type="dxa" w:w="2835"/>
+            <w:vAlign w:val="center"/>
+            <w:tcMar>
+              <w:top w:w="90" w:type="dxa"/>
+              <w:bottom w:w="90" w:type="dxa"/>
+              <w:left w:w="110" w:type="dxa"/>
+              <w:right w:w="110" w:type="dxa"/>
+            </w:tcMar>
+            <w:tcBorders>
+              <w:top w:val="single" w:sz="4" w:color="D9D9D9"/>
+              <w:bottom w:val="single" w:sz="4" w:color="D9D9D9"/>
+              <w:left w:val="single" w:sz="4" w:color="D9D9D9"/>
+              <w:right w:val="single" w:sz="4" w:color="D9D9D9"/>
+            </w:tcBorders>
+            <w:shd w:fill="F5F5F5"/>
+          </w:tcPr>
+          <w:p>
+            <w:pPr>
+              <w:spacing w:after="0" w:before="0" w:line="276" w:lineRule="auto"/>
+            </w:pPr>
+            <w:r>
+              <w:rPr>
+                <w:sz w:val="18"/>
+              </w:rPr>
+              <w:t>NULL</w:t>
+            </w:r>
+          </w:p>
+        </w:tc>
+        <w:tc>
+          <w:tcPr>
+            <w:tcW w:type="dxa" w:w="2438"/>
+            <w:vAlign w:val="center"/>
+            <w:tcMar>
+              <w:top w:w="90" w:type="dxa"/>
+              <w:bottom w:w="90" w:type="dxa"/>
+              <w:left w:w="110" w:type="dxa"/>
+              <w:right w:w="110" w:type="dxa"/>
+            </w:tcMar>
+            <w:tcBorders>
+              <w:top w:val="single" w:sz="4" w:color="D9D9D9"/>
+              <w:bottom w:val="single" w:sz="4" w:color="D9D9D9"/>
+              <w:left w:val="single" w:sz="4" w:color="D9D9D9"/>
+              <w:right w:val="single" w:sz="4" w:color="D9D9D9"/>
+            </w:tcBorders>
+            <w:shd w:fill="F5F5F5"/>
+          </w:tcPr>
+          <w:p>
+            <w:r>
+              <w:t>—</w:t>
+            </w:r>
+          </w:p>
+        </w:tc>
+      </w:tr>
     </w:tbl>
     <w:p>
       <w:pPr>
@@ -5776,9 +6190,27 @@
       <w:pPr>
         <w:pStyle w:val="ListBullet"/>
       </w:pPr>
+      <w:pPr>
+        <w:pStyle w:val="ListBullet"/>
+      </w:pPr>
+      <w:r>
+        <w:t>UNIQUE KEY uk_users_password_reset_hash (password_reset_hash)</w:t>
+      </w:r>
+    </w:p>
+    <w:p>
+      <w:pPr>
+        <w:pStyle w:val="ListBullet"/>
+      </w:pPr>
       <w:pPr/>
       <w:r>
         <w:t>email_verified の初期値1は既存ユーザーの利用継続のためです。新規登録Serviceは0を明示し、メール内の確認操作が完了するまでログインを許可しません。認証待ちの値だけを一意にするため、トークンハッシュはNULLを許容します。</w:t>
+      </w:r>
+    </w:p>
+    <w:p>
+      <w:pPr/>
+      <w:pPr/>
+      <w:r>
+        <w:t>password_reset_hash はメール認証とは別のSHA-256ハッシュです。30分間の再設定待ちだけ値を持ち、使用済み・パスワード変更・メールアドレス変更でハッシュと期限をNULLへ戻します。password_reset_sent_at は60秒の送信間隔を守るため、使用後も維持します。再設定要求だけでは password_hash を変更しません。temporary_password は旧方式で発行済みの会員との互換性のため残し、新規の仮パスワードは発行せず、新パスワード確定時に0へ戻します。</w:t>
       </w:r>
     </w:p>
     <w:p>
@@ -20910,7 +21342,7 @@
         <w:pStyle w:val="ListBullet"/>
       </w:pPr>
       <w:r>
-        <w:t>管理者権限：users.admin を真偽値として管理します。初期値0は一般ユーザー、1は管理者です。</w:t>
+        <w:t>管理者権限：users.admin を真偽値として管理します。初期値0は一般ユーザー、1は管理者です。初期管理者の作成は明示的な初回設定だけで行い、既存会員の上書き・昇格は行いません。旧既定パスワードの管理者レコードは自動変更せず、ログインと残ったセッションを拒否します。移行時に新管理者を作成し、旧管理者の権限をどう扱うか明示的に決めます。</w:t>
       </w:r>
     </w:p>
     <w:p>
@@ -20918,7 +21350,7 @@
         <w:pStyle w:val="ListBullet"/>
       </w:pPr>
       <w:r>
-        <w:t>会員登録：メールアドレスは一意。パスワードは password_hash にハッシュを保存し、仮パスワード状態は temporary_password で管理します。新規会員はアプリが email_verified=0 を明示し、SMTP送信まで同じトランザクションで行います。送信失敗時は登録を取り消します。</w:t>
+        <w:t>会員登録：メールアドレスは一意。パスワードは password_hash にBCryptハッシュを保存します。新規会員はアプリが email_verified=0 を明示し、SMTP送信まで同じトランザクションで行います。送信失敗時は登録を取り消します。</w:t>
       </w:r>
     </w:p>
     <w:p>
@@ -20940,7 +21372,29 @@
         <w:pStyle w:val="ListBullet"/>
       </w:pPr>
       <w:r>
-        <w:t>メール変更：未認証化と新しいメールアドレスへのSMTP送信を同じトランザクションに含めます。失敗時は元のメールアドレス・認証状態・トークン情報を保持します。送信成功時はログアウトし、認証後にログインします。仮パスワード再発行で認証状態は変更しません。</w:t>
+        <w:t>メール変更：未認証化、未使用のパスワード再設定トークンの無効化、新しいメールアドレスへのSMTP送信を同じトランザクションに含めます。失敗時は元のメールアドレス・認証状態・トークン情報を保持します。送信成功時はログアウトし、認証後にログインします。</w:t>
+      </w:r>
+    </w:p>
+    <w:p>
+      <w:pPr>
+        <w:pStyle w:val="ListBullet"/>
+      </w:pPr>
+      <w:pPr>
+        <w:pStyle w:val="ListBullet"/>
+      </w:pPr>
+      <w:r>
+        <w:t>パスワード再設定：認証済み会員の行をロックし、60秒間隔で32バイト乱数のURL-safeトークンを発行します。SHA-256の64文字ハッシュと30分の期限・送信日時だけを保存し、旧パスワードを維持します。SMTP失敗時はロールバックし、再送成功時だけ旧リンクを失効させます。CSRF保護付きPOSTで行ロック下に未使用・期限内・認証済みを検証し、新ハッシュの保存とトークン消費を同時に行います。GETだけでは変更・消費しません。会員設定からのパスワード変更でも再設定ハッシュ・期限を消去します。</w:t>
+      </w:r>
+    </w:p>
+    <w:p>
+      <w:pPr>
+        <w:pStyle w:val="ListBullet"/>
+      </w:pPr>
+      <w:pPr>
+        <w:pStyle w:val="ListBullet"/>
+      </w:pPr>
+      <w:r>
+        <w:t>セッションの失効：静的ファイル以外の認証済みリクエストで会員の現在値を取得し、ハッシュ・メールアドレス・認証状態・権限の変更や会員削除で古いセッションを拒否します。追加のセッション管理テーブルは設けません。</w:t>
       </w:r>
     </w:p>
     <w:p>
@@ -21012,7 +21466,7 @@
         <w:pStyle w:val="ListBullet"/>
       </w:pPr>
       <w:r>
-        <w:t>プロフィール画像：1ユーザーにつき最大1件。画像本体・MIMEタイプ・表示位置・拡大率を保存します。</w:t>
+        <w:t>プロフィール画像：1ユーザーにつき最大1件。JPEG・PNG・GIFの実形式と2000万画素以下を展開前に検証し、GIFは論理画面と全フレームにも上限を適用します。受信は20MBまで、保存は900KB以下とし、大きい画像は初期長辺1600px以下を目標にJPEGへ圧縮します。小さいGIFは元画像を保持します。画像本体・実形式から決めたMIME・表示位置・拡大率を保存し、今回の検証追加に画像テーブルの変更はありません。</w:t>
       </w:r>
     </w:p>
     <w:p>
@@ -21838,6 +22292,18 @@
     <w:p>
       <w:r>
         <w:t>既存DBで詳細紹介テーブルがない場合は data/sake_page_details_schema.sql を適用します。メール認証を追加する既存DBでは、接続先を確認し、バックアップ後、アプリ起動前に data/email_verification_schema.sql を適用します。既存ユーザーは email_verified=1 の初期値で保持します。新規作成SQLにも同じ4列と一意索引を含めます。初期管理者はアプリから認証済みで作ります。適用手順と確認項目は docs/email-verification.md を参照してください。初心者ガイドとメジャー候補の追加に伴うDB構造変更はありません。</w:t>
+      </w:r>
+    </w:p>
+    <w:p>
+      <w:pPr/>
+      <w:r>
+        <w:t>パスワード再設定は password_reset_token_schema.sql で既存の users にNULL許容3列と一意索引を追加します。SQLは USE を指定せず、既存会員・パスワードの変更やDB初期化は行いません。実際の接続先とバックアップを確認し、列・索引が未追加のDBへ起動前に一度だけ適用してください。新規作成SQLには同じ3列・索引を含めるため、両方を重複適用しません。旧 password_reset_schema.sql は temporary_password 列用であり、この差分SQLの代わりにはなりません。ddl-auto=validate は維持します。今回の実DB適用・再照合は本書では確認済みとしていません。</w:t>
+      </w:r>
+    </w:p>
+    <w:p>
+      <w:pPr/>
+      <w:r>
+        <w:t>安全な管理者移行・バックアップ・公開構成の確認項目は SECURITY.md と admin.md を参照してください。</w:t>
       </w:r>
     </w:p>
     <w:p>

</xml_diff>